<commit_message>
docs: the 2026-10-22 LAN rehearsal in FTC_BETA_PLAN §5 B1 (what passed, the races, ChromeOS resolving .local by mDNS only, offline limits over plain HTTP, the rounding fix), RH1 for what waits until after Athens, and the scout card says not to reload or leave the page while offline
Co-Authored-By: Claude Opus 5.5 <noreply@anthropic.com>
Claude-Session: https://claude.ai/code/session_012K1o4pemGUu2ZmMLNfkjDK
</commit_message>
<xml_diff>
--- a/docs/event/print/scout-card.docx
+++ b/docs/event/print/scout-card.docx
@@ -267,11 +267,21 @@
               <w:rPr>
                 <w:b/>
               </w:rPr>
-              <w:t>Offline · 2 held</w:t>
-            </w:r>
-            <w:r>
-              <w:rPr/>
-              <w:t xml:space="preserve"> means it is waiting on this laptop: keep the page open, never clear the browser, and tell the lead scout. </w:t>
+              <w:t>Offline · 1 held</w:t>
+            </w:r>
+            <w:r>
+              <w:rPr/>
+              <w:t xml:space="preserve"> means it is waiting on this laptop: </w:t>
+            </w:r>
+            <w:r>
+              <w:rPr>
+                <w:b/>
+              </w:rPr>
+              <w:t>do not reload, click a link or close the tab</w:t>
+            </w:r>
+            <w:r>
+              <w:rPr/>
+              <w:t xml:space="preserve"> (the page will not come back until the server does), never clear the browser, tell the lead scout, and switch to paper. </w:t>
             </w:r>
           </w:p>
           <w:p>
@@ -750,11 +760,21 @@
               <w:rPr>
                 <w:b/>
               </w:rPr>
-              <w:t>Offline · 2 held</w:t>
-            </w:r>
-            <w:r>
-              <w:rPr/>
-              <w:t xml:space="preserve"> means it is waiting on this laptop: keep the page open, never clear the browser, and tell the lead scout. </w:t>
+              <w:t>Offline · 1 held</w:t>
+            </w:r>
+            <w:r>
+              <w:rPr/>
+              <w:t xml:space="preserve"> means it is waiting on this laptop: </w:t>
+            </w:r>
+            <w:r>
+              <w:rPr>
+                <w:b/>
+              </w:rPr>
+              <w:t>do not reload, click a link or close the tab</w:t>
+            </w:r>
+            <w:r>
+              <w:rPr/>
+              <w:t xml:space="preserve"> (the page will not come back until the server does), never clear the browser, tell the lead scout, and switch to paper. </w:t>
             </w:r>
           </w:p>
           <w:p>

</xml_diff>

<commit_message>
docs: OF1 in ACTION_ITEMS, HTTPS_SETUP (scouting goes on offline over https; the chip counts what is held on every page; the verify step stops the server, since DevTools' offline mode does not reach the worker) and the scout card (with the padlock keep scouting; without it, paper), rebuilt
Co-Authored-By: Claude Opus 5.5 <noreply@anthropic.com>
Claude-Session: https://claude.ai/code/session_012K1o4pemGUu2ZmMLNfkjDK
</commit_message>
<xml_diff>
--- a/docs/event/print/scout-card.docx
+++ b/docs/event/print/scout-card.docx
@@ -247,7 +247,7 @@
               <w:rPr>
                 <w:b/>
               </w:rPr>
-              <w:t>Check the chip in the header:</w:t>
+              <w:t>Check the chip:</w:t>
             </w:r>
             <w:r>
               <w:rPr/>
@@ -261,7 +261,7 @@
             </w:r>
             <w:r>
               <w:rPr/>
-              <w:t xml:space="preserve"> means the server has it. </w:t>
+              <w:t xml:space="preserve">: the server has it. </w:t>
             </w:r>
             <w:r>
               <w:rPr>
@@ -271,17 +271,27 @@
             </w:r>
             <w:r>
               <w:rPr/>
-              <w:t xml:space="preserve"> means it is waiting on this laptop: </w:t>
-            </w:r>
-            <w:r>
-              <w:rPr>
-                <w:b/>
-              </w:rPr>
-              <w:t>do not reload, click a link or close the tab</w:t>
-            </w:r>
-            <w:r>
-              <w:rPr/>
-              <w:t xml:space="preserve"> (the page will not come back until the server does), never clear the browser, tell the lead scout, and switch to paper. </w:t>
+              <w:t xml:space="preserve">: kept on this laptop, sent when the server is back; never clear the browser. </w:t>
+            </w:r>
+            <w:r>
+              <w:rPr>
+                <w:b/>
+              </w:rPr>
+              <w:t>Padlock (https):</w:t>
+            </w:r>
+            <w:r>
+              <w:rPr/>
+              <w:t xml:space="preserve"> keep scouting, each save is held. </w:t>
+            </w:r>
+            <w:r>
+              <w:rPr>
+                <w:b/>
+              </w:rPr>
+              <w:t>No padlock:</w:t>
+            </w:r>
+            <w:r>
+              <w:rPr/>
+              <w:t xml:space="preserve"> do not reload or leave the page; tell the lead, switch to paper. </w:t>
             </w:r>
           </w:p>
           <w:p>
@@ -469,7 +479,7 @@
               <w:rPr>
                 <w:b/>
               </w:rPr>
-              <w:t>App down?</w:t>
+              <w:t>The laptop itself fails, or http with no server?</w:t>
             </w:r>
             <w:r>
               <w:rPr/>
@@ -740,7 +750,7 @@
               <w:rPr>
                 <w:b/>
               </w:rPr>
-              <w:t>Check the chip in the header:</w:t>
+              <w:t>Check the chip:</w:t>
             </w:r>
             <w:r>
               <w:rPr/>
@@ -754,7 +764,7 @@
             </w:r>
             <w:r>
               <w:rPr/>
-              <w:t xml:space="preserve"> means the server has it. </w:t>
+              <w:t xml:space="preserve">: the server has it. </w:t>
             </w:r>
             <w:r>
               <w:rPr>
@@ -764,17 +774,27 @@
             </w:r>
             <w:r>
               <w:rPr/>
-              <w:t xml:space="preserve"> means it is waiting on this laptop: </w:t>
-            </w:r>
-            <w:r>
-              <w:rPr>
-                <w:b/>
-              </w:rPr>
-              <w:t>do not reload, click a link or close the tab</w:t>
-            </w:r>
-            <w:r>
-              <w:rPr/>
-              <w:t xml:space="preserve"> (the page will not come back until the server does), never clear the browser, tell the lead scout, and switch to paper. </w:t>
+              <w:t xml:space="preserve">: kept on this laptop, sent when the server is back; never clear the browser. </w:t>
+            </w:r>
+            <w:r>
+              <w:rPr>
+                <w:b/>
+              </w:rPr>
+              <w:t>Padlock (https):</w:t>
+            </w:r>
+            <w:r>
+              <w:rPr/>
+              <w:t xml:space="preserve"> keep scouting, each save is held. </w:t>
+            </w:r>
+            <w:r>
+              <w:rPr>
+                <w:b/>
+              </w:rPr>
+              <w:t>No padlock:</w:t>
+            </w:r>
+            <w:r>
+              <w:rPr/>
+              <w:t xml:space="preserve"> do not reload or leave the page; tell the lead, switch to paper. </w:t>
             </w:r>
           </w:p>
           <w:p>
@@ -962,7 +982,7 @@
               <w:rPr>
                 <w:b/>
               </w:rPr>
-              <w:t>App down?</w:t>
+              <w:t>The laptop itself fails, or http with no server?</w:t>
             </w:r>
             <w:r>
               <w:rPr/>

</xml_diff>